<commit_message>
docs(m7): la auditoria muestra las tres preguntas por test, y el baseline a mano
Tres huecos contra la rubrica del LabX, cerrados:

1. La auditoria daba el veredicto pero no ENSEÑABA las tres preguntas. Ahora
   cada test del agente tiene su columna P1/P2/P3 y se ve cual fallo:
   6 duplicados, 2 con el nombre mintiendo, 1 que se contradecia con otro.
2. Faltaba el primer paso del ciclo: los tests a mano. Se anade §2 con los
   ficheros, el recuento y su corrida (85 passed / 14 passed).
3. La fila «sin ficheros de test» del entregable principal quedaba a medias.
   Se explica que ese alcance se midio una sola vez, y por que no se sigue.

Aritmetica verificada de punta a punta: 2050+3264=5.314 tokens de entrada,
359+519=878 de salida, 587,1+1012,1 s = 26 min 39 s; 8+6=14 generados,
7+2=9 borrados, 1+4=5 aceptados; 863+5=868; 2.809-2.706=103 sin cubrir,
menos 45 de seeds -> 97,76 % sobre 2.585.

Co-Authored-By: Claude Opus 5 <noreply@anthropic.com>
</commit_message>
<xml_diff>
--- a/docs/M7_ACTIVIDAD2_SUITE_MEDIDA.docx
+++ b/docs/M7_ACTIVIDAD2_SUITE_MEDIDA.docx
@@ -508,7 +508,7 @@
           <w:p>
             <w:r/>
             <w:r>
-              <w:t>Sin ficheros de test</w:t>
+              <w:t>Sin ficheros de test †</w:t>
             </w:r>
           </w:p>
         </w:tc>
@@ -773,6 +773,30 @@
         <w:t>.venv/Scripts/python -m pytest --cov=. --cov-report=json:cov.json --cov-fail-under=0</w:t>
         <w:br/>
         <w:t>.venv/Scripts/python scripts/cobertura_produccion.py cov.json apps/</w:t>
+      </w:r>
+    </w:p>
+    <w:p>
+      <w:r>
+        <w:t xml:space="preserve">† Ese alcance intermedio —quitar los ficheros de test pero dejar los </w:t>
+      </w:r>
+      <w:r>
+        <w:rPr>
+          <w:rFonts w:ascii="Consolas" w:hAnsi="Consolas"/>
+          <w:sz w:val="19"/>
+        </w:rPr>
+        <w:t>management/commands/</w:t>
+      </w:r>
+      <w:r>
+        <w:t xml:space="preserve">— se midió </w:t>
+      </w:r>
+      <w:r>
+        <w:rPr>
+          <w:b/>
+        </w:rPr>
+        <w:t>una sola vez, al principio</w:t>
+      </w:r>
+      <w:r>
+        <w:t>, para enseñar cuánto infla la cifra el hecho de contar los propios tests: 82,25 % frente a 65,41 % sobre la misma suite. No se sigue en las mediciones posteriores porque no es el número que decide dónde trabajar; el que decide es el de la última fila.</w:t>
       </w:r>
     </w:p>
     <w:p>

</xml_diff>

<commit_message>
docs(m7): la §8 contradecia a la §1 con las cifras viejas
La §8 abria con «ya cumple RN-09: 91,74 %» y «pytest-cov 86,00 %», que eran
las cifras de la tanda de frontera, no las finales. La §1 y la §6 ya decian
96,33 % y 88,59 %. Un documento que se contradice a si mismo invalida el
numero aunque el numero sea correcto.

Verificadas todas las apariciones de las cifras clave en los dos documentos:
96,33 (×3), 88,59 (×2), 868 (×4), 985 (×2), 241 (×3). Las de 91,74 y 86,00
que quedan son las columnas historicas de la tabla de la §1, donde
corresponden.

Co-Authored-By: Claude Opus 5 <noreply@anthropic.com>
</commit_message>
<xml_diff>
--- a/docs/M7_ACTIVIDAD2_SUITE_MEDIDA.docx
+++ b/docs/M7_ACTIVIDAD2_SUITE_MEDIDA.docx
@@ -7674,7 +7674,16 @@
         <w:t>El código de producción del clínico ya cumple RN-09</w:t>
       </w:r>
       <w:r>
-        <w:t xml:space="preserve">: 91,74 %, por encima del 90 % exigido. La cifra que reporta </w:t>
+        <w:t xml:space="preserve">: </w:t>
+      </w:r>
+      <w:r>
+        <w:rPr>
+          <w:b/>
+        </w:rPr>
+        <w:t>96,33 %</w:t>
+      </w:r>
+      <w:r>
+        <w:t xml:space="preserve">, muy por encima del 90 % exigido. La cifra que reporta </w:t>
       </w:r>
       <w:r>
         <w:rPr>
@@ -7684,7 +7693,7 @@
         <w:t>pytest-cov</w:t>
       </w:r>
       <w:r>
-        <w:t xml:space="preserve"> en bruto sigue por debajo (86,00 %) porque mezcla los ficheros de test y los </w:t>
+        <w:t xml:space="preserve"> en bruto sigue por debajo (88,59 %) porque mezcla los ficheros de test y los </w:t>
       </w:r>
       <w:r>
         <w:rPr>

</xml_diff>